<commit_message>
Batcha picks: split pricing into heated vs unheated (with lab report)
Each piece now shows two U.S. retail estimates — heated Ceylon sapphire
(commercial norm) and natural unheated with a reputable report — plus a
per-piece note on how much heat actually matters: large premium on single
blue-sapphire pieces, small on multi-color fancy melee, and not applicable
to the moonstone/cat's-eye pieces. Caveat box updated to explain both.

Co-Authored-By: Claude Opus 4.8 <noreply@anthropic.com>
Claude-Session: https://claude.ai/code/session_01144F4MAUEudCKPLp3XvJcy
</commit_message>
<xml_diff>
--- a/Sri_Lanka_Jewelry_Buying_Guide/Batcha_Gems_Top_Picks.docx
+++ b/Sri_Lanka_Jewelry_Buying_Guide/Batcha_Gems_Top_Picks.docx
@@ -97,6 +97,28 @@
             </w:r>
           </w:p>
           <w:p>
+            <w:pPr>
+              <w:spacing w:after="60"/>
+            </w:pPr>
+            <w:r>
+              <w:rPr>
+                <w:b/>
+                <w:bCs/>
+                <w:color w:val="7A5A12"/>
+                <w:sz w:val="19"/>
+                <w:szCs w:val="19"/>
+              </w:rPr>
+              <w:t xml:space="preserve">Each piece shows two estimates. </w:t>
+            </w:r>
+            <w:r>
+              <w:rPr>
+                <w:sz w:val="19"/>
+                <w:szCs w:val="19"/>
+              </w:rPr>
+              <w:t xml:space="preserve">"Heated" assumes good-quality HEATED Ceylon sapphire (the commercial norm). "Unheated (with lab report)" assumes the main/center sapphire is natural unheated with a reputable report (GRS / GIA / SSEF / Lotus). Carats are estimated from the photos.</w:t>
+            </w:r>
+          </w:p>
+          <w:p>
             <w:r>
               <w:rPr>
                 <w:i/>
@@ -104,7 +126,7 @@
                 <w:sz w:val="19"/>
                 <w:szCs w:val="19"/>
               </w:rPr>
-              <w:t xml:space="preserve">Estimates assume HEATED Ceylon sapphires of good commercial quality and the gold + diamond content visible in the photos, with carat weights estimated from images. Confirm on each piece: carat weight, heated vs unheated + lab report, metal purity/weight, and total diamond carat — an unheated stone with a GRS/GIA/SSEF report can multiply the value several times over.</w:t>
+              <w:t xml:space="preserve">The unheated premium is largest on single-stone blue-sapphire pieces and much smaller on multi-color fancy-melee pieces (heat status there is commercially minor and rarely certified). It does not apply to the moonstone / cat’s-eye pieces (moonstone is untreated), and for star sapphire the key is “no diffusion” + a sharp natural star rather than heat. Always confirm carat, treatment + report, metal purity/weight, and total diamond carat.</w:t>
             </w:r>
           </w:p>
         </w:tc>
@@ -239,7 +261,7 @@
     </w:p>
     <w:p>
       <w:pPr>
-        <w:spacing w:after="30"/>
+        <w:spacing w:after="20"/>
       </w:pPr>
       <w:r>
         <w:rPr>
@@ -249,7 +271,7 @@
           <w:sz w:val="20"/>
           <w:szCs w:val="20"/>
         </w:rPr>
-        <w:t xml:space="preserve">Comfortable U.S. retail (est.):  </w:t>
+        <w:t xml:space="preserve">Est. U.S. retail — heated:  </w:t>
       </w:r>
       <w:r>
         <w:rPr>
@@ -264,8 +286,43 @@
     </w:p>
     <w:p>
       <w:pPr>
-        <w:spacing w:after="60"/>
-      </w:pPr>
+        <w:spacing w:after="20"/>
+      </w:pPr>
+      <w:r>
+        <w:rPr>
+          <w:b/>
+          <w:bCs/>
+          <w:color w:val="123A4F"/>
+          <w:sz w:val="20"/>
+          <w:szCs w:val="20"/>
+        </w:rPr>
+        <w:t xml:space="preserve">Est. U.S. retail — unheated (w/ report):  </w:t>
+      </w:r>
+      <w:r>
+        <w:rPr>
+          <w:b/>
+          <w:bCs/>
+          <w:color w:val="B8862F"/>
+          <w:sz w:val="22"/>
+          <w:szCs w:val="22"/>
+        </w:rPr>
+        <w:t xml:space="preserve">$9,000 – $20,000</w:t>
+      </w:r>
+    </w:p>
+    <w:p>
+      <w:pPr>
+        <w:spacing w:after="20"/>
+      </w:pPr>
+      <w:r>
+        <w:rPr>
+          <w:b/>
+          <w:bCs/>
+          <w:color w:val="5B6472"/>
+          <w:sz w:val="17"/>
+          <w:szCs w:val="17"/>
+        </w:rPr>
+        <w:t xml:space="preserve">Heated vs unheated:  </w:t>
+      </w:r>
       <w:r>
         <w:rPr>
           <w:i/>
@@ -274,7 +331,33 @@
           <w:sz w:val="17"/>
           <w:szCs w:val="17"/>
         </w:rPr>
-        <w:t xml:space="preserve">Note: Carat + heat/cert drive this most. Estimate assumes a heated Ceylon stone; an UNHEATED stone with a GRS/GIA report can push comfortable retail to $10k+.</w:t>
+        <w:t xml:space="preserve">Biggest driver here — a fine UNHEATED Ceylon blue with a GRS/GIA/SSEF report commands a large premium over heated.</w:t>
+      </w:r>
+    </w:p>
+    <w:p>
+      <w:pPr>
+        <w:spacing w:after="60"/>
+      </w:pPr>
+      <w:r>
+        <w:rPr>
+          <w:i/>
+          <w:iCs/>
+          <w:color w:val="5B6472"/>
+          <w:sz w:val="17"/>
+          <w:szCs w:val="17"/>
+        </w:rPr>
+        <w:t xml:space="preserve">Also confirm: Carat + heat/cert drive this most. Estimate assumes a heated Ceylon stone; an UNHEATED stone with a GRS/GIA report can push comfortable retail to $10k+.</w:t>
+      </w:r>
+    </w:p>
+    <w:p>
+      <w:pPr>
+        <w:pBdr>
+          <w:bottom w:val="single" w:color="E3DDD0" w:sz="4"/>
+        </w:pBdr>
+        <w:spacing w:after="60"/>
+      </w:pPr>
+      <w:r>
+        <w:t xml:space="preserve"/>
       </w:r>
     </w:p>
     <w:p>
@@ -398,7 +481,7 @@
     </w:p>
     <w:p>
       <w:pPr>
-        <w:spacing w:after="30"/>
+        <w:spacing w:after="20"/>
       </w:pPr>
       <w:r>
         <w:rPr>
@@ -408,7 +491,7 @@
           <w:sz w:val="20"/>
           <w:szCs w:val="20"/>
         </w:rPr>
-        <w:t xml:space="preserve">Comfortable U.S. retail (est.):  </w:t>
+        <w:t xml:space="preserve">Est. U.S. retail — heated:  </w:t>
       </w:r>
       <w:r>
         <w:rPr>
@@ -423,8 +506,43 @@
     </w:p>
     <w:p>
       <w:pPr>
-        <w:spacing w:after="60"/>
-      </w:pPr>
+        <w:spacing w:after="20"/>
+      </w:pPr>
+      <w:r>
+        <w:rPr>
+          <w:b/>
+          <w:bCs/>
+          <w:color w:val="123A4F"/>
+          <w:sz w:val="20"/>
+          <w:szCs w:val="20"/>
+        </w:rPr>
+        <w:t xml:space="preserve">Est. U.S. retail — unheated (w/ report):  </w:t>
+      </w:r>
+      <w:r>
+        <w:rPr>
+          <w:b/>
+          <w:bCs/>
+          <w:color w:val="B8862F"/>
+          <w:sz w:val="22"/>
+          <w:szCs w:val="22"/>
+        </w:rPr>
+        <w:t xml:space="preserve">$1,000 – $2,600</w:t>
+      </w:r>
+    </w:p>
+    <w:p>
+      <w:pPr>
+        <w:spacing w:after="20"/>
+      </w:pPr>
+      <w:r>
+        <w:rPr>
+          <w:b/>
+          <w:bCs/>
+          <w:color w:val="5B6472"/>
+          <w:sz w:val="17"/>
+          <w:szCs w:val="17"/>
+        </w:rPr>
+        <w:t xml:space="preserve">Heated vs unheated:  </w:t>
+      </w:r>
       <w:r>
         <w:rPr>
           <w:i/>
@@ -433,12 +551,33 @@
           <w:sz w:val="17"/>
           <w:szCs w:val="17"/>
         </w:rPr>
-        <w:t xml:space="preserve">Note: Per pair. Halo studs ~$600–1,300; pear drop earrings ~$700–1,400, depending on carat and gold weight.</w:t>
-      </w:r>
-    </w:p>
-    <w:p>
-      <w:r>
-        <w:br w:type="page"/>
+        <w:t xml:space="preserve">Modest premium; small halo/drop stones are rarely individually certified, so unheated mainly matters if papers come with them.</w:t>
+      </w:r>
+    </w:p>
+    <w:p>
+      <w:pPr>
+        <w:spacing w:after="60"/>
+      </w:pPr>
+      <w:r>
+        <w:rPr>
+          <w:i/>
+          <w:iCs/>
+          <w:color w:val="5B6472"/>
+          <w:sz w:val="17"/>
+          <w:szCs w:val="17"/>
+        </w:rPr>
+        <w:t xml:space="preserve">Also confirm: Per pair. Halo studs ~$600–1,300; pear drop earrings ~$700–1,400, depending on carat and gold weight.</w:t>
+      </w:r>
+    </w:p>
+    <w:p>
+      <w:pPr>
+        <w:pBdr>
+          <w:bottom w:val="single" w:color="E3DDD0" w:sz="4"/>
+        </w:pBdr>
+        <w:spacing w:after="60"/>
+      </w:pPr>
+      <w:r>
+        <w:t xml:space="preserve"/>
       </w:r>
     </w:p>
     <w:p>
@@ -562,7 +701,7 @@
     </w:p>
     <w:p>
       <w:pPr>
-        <w:spacing w:after="30"/>
+        <w:spacing w:after="20"/>
       </w:pPr>
       <w:r>
         <w:rPr>
@@ -572,7 +711,7 @@
           <w:sz w:val="20"/>
           <w:szCs w:val="20"/>
         </w:rPr>
-        <w:t xml:space="preserve">Comfortable U.S. retail (est.):  </w:t>
+        <w:t xml:space="preserve">Est. U.S. retail — heated:  </w:t>
       </w:r>
       <w:r>
         <w:rPr>
@@ -587,8 +726,43 @@
     </w:p>
     <w:p>
       <w:pPr>
-        <w:spacing w:after="60"/>
-      </w:pPr>
+        <w:spacing w:after="20"/>
+      </w:pPr>
+      <w:r>
+        <w:rPr>
+          <w:b/>
+          <w:bCs/>
+          <w:color w:val="123A4F"/>
+          <w:sz w:val="20"/>
+          <w:szCs w:val="20"/>
+        </w:rPr>
+        <w:t xml:space="preserve">Est. U.S. retail — unheated (w/ report):  </w:t>
+      </w:r>
+      <w:r>
+        <w:rPr>
+          <w:b/>
+          <w:bCs/>
+          <w:color w:val="B8862F"/>
+          <w:sz w:val="22"/>
+          <w:szCs w:val="22"/>
+        </w:rPr>
+        <w:t xml:space="preserve">$2,800 – $6,500</w:t>
+      </w:r>
+    </w:p>
+    <w:p>
+      <w:pPr>
+        <w:spacing w:after="20"/>
+      </w:pPr>
+      <w:r>
+        <w:rPr>
+          <w:b/>
+          <w:bCs/>
+          <w:color w:val="5B6472"/>
+          <w:sz w:val="17"/>
+          <w:szCs w:val="17"/>
+        </w:rPr>
+        <w:t xml:space="preserve">Heated vs unheated:  </w:t>
+      </w:r>
       <w:r>
         <w:rPr>
           <w:i/>
@@ -597,7 +771,33 @@
           <w:sz w:val="17"/>
           <w:szCs w:val="17"/>
         </w:rPr>
-        <w:t xml:space="preserve">Note: Depends heavily on total sapphire + diamond carat weight; confirm both.</w:t>
+        <w:t xml:space="preserve">Premium applies to the sapphires, but melee is seldom certified unheated — realistic only if a report accompanies the pair.</w:t>
+      </w:r>
+    </w:p>
+    <w:p>
+      <w:pPr>
+        <w:spacing w:after="60"/>
+      </w:pPr>
+      <w:r>
+        <w:rPr>
+          <w:i/>
+          <w:iCs/>
+          <w:color w:val="5B6472"/>
+          <w:sz w:val="17"/>
+          <w:szCs w:val="17"/>
+        </w:rPr>
+        <w:t xml:space="preserve">Also confirm: Depends heavily on total sapphire + diamond carat weight; confirm both.</w:t>
+      </w:r>
+    </w:p>
+    <w:p>
+      <w:pPr>
+        <w:pBdr>
+          <w:bottom w:val="single" w:color="E3DDD0" w:sz="4"/>
+        </w:pBdr>
+        <w:spacing w:after="60"/>
+      </w:pPr>
+      <w:r>
+        <w:t xml:space="preserve"/>
       </w:r>
     </w:p>
     <w:p>
@@ -721,7 +921,7 @@
     </w:p>
     <w:p>
       <w:pPr>
-        <w:spacing w:after="30"/>
+        <w:spacing w:after="20"/>
       </w:pPr>
       <w:r>
         <w:rPr>
@@ -731,7 +931,7 @@
           <w:sz w:val="20"/>
           <w:szCs w:val="20"/>
         </w:rPr>
-        <w:t xml:space="preserve">Comfortable U.S. retail (est.):  </w:t>
+        <w:t xml:space="preserve">Est. U.S. retail — heated:  </w:t>
       </w:r>
       <w:r>
         <w:rPr>
@@ -746,8 +946,43 @@
     </w:p>
     <w:p>
       <w:pPr>
-        <w:spacing w:after="60"/>
-      </w:pPr>
+        <w:spacing w:after="20"/>
+      </w:pPr>
+      <w:r>
+        <w:rPr>
+          <w:b/>
+          <w:bCs/>
+          <w:color w:val="123A4F"/>
+          <w:sz w:val="20"/>
+          <w:szCs w:val="20"/>
+        </w:rPr>
+        <w:t xml:space="preserve">Est. U.S. retail — unheated (w/ report):  </w:t>
+      </w:r>
+      <w:r>
+        <w:rPr>
+          <w:b/>
+          <w:bCs/>
+          <w:color w:val="B8862F"/>
+          <w:sz w:val="22"/>
+          <w:szCs w:val="22"/>
+        </w:rPr>
+        <w:t xml:space="preserve">$2,800 – $6,500</w:t>
+      </w:r>
+    </w:p>
+    <w:p>
+      <w:pPr>
+        <w:spacing w:after="20"/>
+      </w:pPr>
+      <w:r>
+        <w:rPr>
+          <w:b/>
+          <w:bCs/>
+          <w:color w:val="5B6472"/>
+          <w:sz w:val="17"/>
+          <w:szCs w:val="17"/>
+        </w:rPr>
+        <w:t xml:space="preserve">Heated vs unheated:  </w:t>
+      </w:r>
       <w:r>
         <w:rPr>
           <w:i/>
@@ -756,12 +991,33 @@
           <w:sz w:val="17"/>
           <w:szCs w:val="17"/>
         </w:rPr>
-        <w:t xml:space="preserve">Note: Value scales with total carat weight (often 8–12 ct+). Confirm cttw and gold weight.</w:t>
-      </w:r>
-    </w:p>
-    <w:p>
-      <w:r>
-        <w:br w:type="page"/>
+        <w:t xml:space="preserve">Multi-color fancy melee — heat status is commercially minor here and rarely certified; treat the premium as small.</w:t>
+      </w:r>
+    </w:p>
+    <w:p>
+      <w:pPr>
+        <w:spacing w:after="60"/>
+      </w:pPr>
+      <w:r>
+        <w:rPr>
+          <w:i/>
+          <w:iCs/>
+          <w:color w:val="5B6472"/>
+          <w:sz w:val="17"/>
+          <w:szCs w:val="17"/>
+        </w:rPr>
+        <w:t xml:space="preserve">Also confirm: Value scales with total carat weight (often 8–12 ct+). Confirm cttw and gold weight.</w:t>
+      </w:r>
+    </w:p>
+    <w:p>
+      <w:pPr>
+        <w:pBdr>
+          <w:bottom w:val="single" w:color="E3DDD0" w:sz="4"/>
+        </w:pBdr>
+        <w:spacing w:after="60"/>
+      </w:pPr>
+      <w:r>
+        <w:t xml:space="preserve"/>
       </w:r>
     </w:p>
     <w:p>
@@ -885,7 +1141,7 @@
     </w:p>
     <w:p>
       <w:pPr>
-        <w:spacing w:after="30"/>
+        <w:spacing w:after="20"/>
       </w:pPr>
       <w:r>
         <w:rPr>
@@ -895,7 +1151,7 @@
           <w:sz w:val="20"/>
           <w:szCs w:val="20"/>
         </w:rPr>
-        <w:t xml:space="preserve">Comfortable U.S. retail (est.):  </w:t>
+        <w:t xml:space="preserve">Est. U.S. retail — heated:  </w:t>
       </w:r>
       <w:r>
         <w:rPr>
@@ -910,8 +1166,43 @@
     </w:p>
     <w:p>
       <w:pPr>
-        <w:spacing w:after="60"/>
-      </w:pPr>
+        <w:spacing w:after="20"/>
+      </w:pPr>
+      <w:r>
+        <w:rPr>
+          <w:b/>
+          <w:bCs/>
+          <w:color w:val="123A4F"/>
+          <w:sz w:val="20"/>
+          <w:szCs w:val="20"/>
+        </w:rPr>
+        <w:t xml:space="preserve">Est. U.S. retail — unheated (w/ report):  </w:t>
+      </w:r>
+      <w:r>
+        <w:rPr>
+          <w:b/>
+          <w:bCs/>
+          <w:color w:val="B8862F"/>
+          <w:sz w:val="22"/>
+          <w:szCs w:val="22"/>
+        </w:rPr>
+        <w:t xml:space="preserve">$3,300 – $7,500</w:t>
+      </w:r>
+    </w:p>
+    <w:p>
+      <w:pPr>
+        <w:spacing w:after="20"/>
+      </w:pPr>
+      <w:r>
+        <w:rPr>
+          <w:b/>
+          <w:bCs/>
+          <w:color w:val="5B6472"/>
+          <w:sz w:val="17"/>
+          <w:szCs w:val="17"/>
+        </w:rPr>
+        <w:t xml:space="preserve">Heated vs unheated:  </w:t>
+      </w:r>
       <w:r>
         <w:rPr>
           <w:i/>
@@ -920,7 +1211,33 @@
           <w:sz w:val="17"/>
           <w:szCs w:val="17"/>
         </w:rPr>
-        <w:t xml:space="preserve">Note: Higher end due to princess-cut calibrated sapphires + diamond borders; confirm cttw.</w:t>
+        <w:t xml:space="preserve">Fancy melee — heat status commercially minor; small premium only.</w:t>
+      </w:r>
+    </w:p>
+    <w:p>
+      <w:pPr>
+        <w:spacing w:after="60"/>
+      </w:pPr>
+      <w:r>
+        <w:rPr>
+          <w:i/>
+          <w:iCs/>
+          <w:color w:val="5B6472"/>
+          <w:sz w:val="17"/>
+          <w:szCs w:val="17"/>
+        </w:rPr>
+        <w:t xml:space="preserve">Also confirm: Higher end due to princess-cut calibrated sapphires + diamond borders; confirm cttw.</w:t>
+      </w:r>
+    </w:p>
+    <w:p>
+      <w:pPr>
+        <w:pBdr>
+          <w:bottom w:val="single" w:color="E3DDD0" w:sz="4"/>
+        </w:pBdr>
+        <w:spacing w:after="60"/>
+      </w:pPr>
+      <w:r>
+        <w:t xml:space="preserve"/>
       </w:r>
     </w:p>
     <w:p>
@@ -1044,7 +1361,7 @@
     </w:p>
     <w:p>
       <w:pPr>
-        <w:spacing w:after="30"/>
+        <w:spacing w:after="20"/>
       </w:pPr>
       <w:r>
         <w:rPr>
@@ -1054,7 +1371,7 @@
           <w:sz w:val="20"/>
           <w:szCs w:val="20"/>
         </w:rPr>
-        <w:t xml:space="preserve">Comfortable U.S. retail (est.):  </w:t>
+        <w:t xml:space="preserve">Est. U.S. retail — heated:  </w:t>
       </w:r>
       <w:r>
         <w:rPr>
@@ -1069,8 +1386,43 @@
     </w:p>
     <w:p>
       <w:pPr>
-        <w:spacing w:after="60"/>
-      </w:pPr>
+        <w:spacing w:after="20"/>
+      </w:pPr>
+      <w:r>
+        <w:rPr>
+          <w:b/>
+          <w:bCs/>
+          <w:color w:val="123A4F"/>
+          <w:sz w:val="20"/>
+          <w:szCs w:val="20"/>
+        </w:rPr>
+        <w:t xml:space="preserve">Est. U.S. retail — unheated (w/ report):  </w:t>
+      </w:r>
+      <w:r>
+        <w:rPr>
+          <w:b/>
+          <w:bCs/>
+          <w:color w:val="B8862F"/>
+          <w:sz w:val="22"/>
+          <w:szCs w:val="22"/>
+        </w:rPr>
+        <w:t xml:space="preserve">$2,300 – $5,200</w:t>
+      </w:r>
+    </w:p>
+    <w:p>
+      <w:pPr>
+        <w:spacing w:after="20"/>
+      </w:pPr>
+      <w:r>
+        <w:rPr>
+          <w:b/>
+          <w:bCs/>
+          <w:color w:val="5B6472"/>
+          <w:sz w:val="17"/>
+          <w:szCs w:val="17"/>
+        </w:rPr>
+        <w:t xml:space="preserve">Heated vs unheated:  </w:t>
+      </w:r>
       <w:r>
         <w:rPr>
           <w:i/>
@@ -1079,12 +1431,33 @@
           <w:sz w:val="17"/>
           <w:szCs w:val="17"/>
         </w:rPr>
-        <w:t xml:space="preserve">Note: Heart-cut fancy sapphires are labor-intensive; confirm total carat and drop count.</w:t>
-      </w:r>
-    </w:p>
-    <w:p>
-      <w:r>
-        <w:br w:type="page"/>
+        <w:t xml:space="preserve">Fancy melee — heat status commercially minor; small premium only.</w:t>
+      </w:r>
+    </w:p>
+    <w:p>
+      <w:pPr>
+        <w:spacing w:after="60"/>
+      </w:pPr>
+      <w:r>
+        <w:rPr>
+          <w:i/>
+          <w:iCs/>
+          <w:color w:val="5B6472"/>
+          <w:sz w:val="17"/>
+          <w:szCs w:val="17"/>
+        </w:rPr>
+        <w:t xml:space="preserve">Also confirm: Heart-cut fancy sapphires are labor-intensive; confirm total carat and drop count.</w:t>
+      </w:r>
+    </w:p>
+    <w:p>
+      <w:pPr>
+        <w:pBdr>
+          <w:bottom w:val="single" w:color="E3DDD0" w:sz="4"/>
+        </w:pBdr>
+        <w:spacing w:after="60"/>
+      </w:pPr>
+      <w:r>
+        <w:t xml:space="preserve"/>
       </w:r>
     </w:p>
     <w:p>
@@ -1208,7 +1581,7 @@
     </w:p>
     <w:p>
       <w:pPr>
-        <w:spacing w:after="30"/>
+        <w:spacing w:after="20"/>
       </w:pPr>
       <w:r>
         <w:rPr>
@@ -1218,7 +1591,7 @@
           <w:sz w:val="20"/>
           <w:szCs w:val="20"/>
         </w:rPr>
-        <w:t xml:space="preserve">Comfortable U.S. retail (est.):  </w:t>
+        <w:t xml:space="preserve">Est. U.S. retail — heated:  </w:t>
       </w:r>
       <w:r>
         <w:rPr>
@@ -1233,8 +1606,43 @@
     </w:p>
     <w:p>
       <w:pPr>
-        <w:spacing w:after="60"/>
-      </w:pPr>
+        <w:spacing w:after="20"/>
+      </w:pPr>
+      <w:r>
+        <w:rPr>
+          <w:b/>
+          <w:bCs/>
+          <w:color w:val="123A4F"/>
+          <w:sz w:val="20"/>
+          <w:szCs w:val="20"/>
+        </w:rPr>
+        <w:t xml:space="preserve">Est. U.S. retail — unheated (w/ report):  </w:t>
+      </w:r>
+      <w:r>
+        <w:rPr>
+          <w:b/>
+          <w:bCs/>
+          <w:color w:val="B8862F"/>
+          <w:sz w:val="22"/>
+          <w:szCs w:val="22"/>
+        </w:rPr>
+        <w:t xml:space="preserve">$750 – $1,700</w:t>
+      </w:r>
+    </w:p>
+    <w:p>
+      <w:pPr>
+        <w:spacing w:after="20"/>
+      </w:pPr>
+      <w:r>
+        <w:rPr>
+          <w:b/>
+          <w:bCs/>
+          <w:color w:val="5B6472"/>
+          <w:sz w:val="17"/>
+          <w:szCs w:val="17"/>
+        </w:rPr>
+        <w:t xml:space="preserve">Heated vs unheated:  </w:t>
+      </w:r>
       <w:r>
         <w:rPr>
           <w:i/>
@@ -1243,7 +1651,33 @@
           <w:sz w:val="17"/>
           <w:szCs w:val="17"/>
         </w:rPr>
-        <w:t xml:space="preserve">Note: Modest diamond/sapphire content; value is mostly design + gold weight. A signature branding piece.</w:t>
+        <w:t xml:space="preserve">One small accent sapphire — heat is immaterial; value is the design + gold.</w:t>
+      </w:r>
+    </w:p>
+    <w:p>
+      <w:pPr>
+        <w:spacing w:after="60"/>
+      </w:pPr>
+      <w:r>
+        <w:rPr>
+          <w:i/>
+          <w:iCs/>
+          <w:color w:val="5B6472"/>
+          <w:sz w:val="17"/>
+          <w:szCs w:val="17"/>
+        </w:rPr>
+        <w:t xml:space="preserve">Also confirm: Modest diamond/sapphire content; value is mostly design + gold weight. A signature branding piece.</w:t>
+      </w:r>
+    </w:p>
+    <w:p>
+      <w:pPr>
+        <w:pBdr>
+          <w:bottom w:val="single" w:color="E3DDD0" w:sz="4"/>
+        </w:pBdr>
+        <w:spacing w:after="60"/>
+      </w:pPr>
+      <w:r>
+        <w:t xml:space="preserve"/>
       </w:r>
     </w:p>
     <w:p>
@@ -1367,7 +1801,7 @@
     </w:p>
     <w:p>
       <w:pPr>
-        <w:spacing w:after="30"/>
+        <w:spacing w:after="20"/>
       </w:pPr>
       <w:r>
         <w:rPr>
@@ -1377,7 +1811,7 @@
           <w:sz w:val="20"/>
           <w:szCs w:val="20"/>
         </w:rPr>
-        <w:t xml:space="preserve">Comfortable U.S. retail (est.):  </w:t>
+        <w:t xml:space="preserve">Est. U.S. retail — heated:  </w:t>
       </w:r>
       <w:r>
         <w:rPr>
@@ -1392,8 +1826,43 @@
     </w:p>
     <w:p>
       <w:pPr>
-        <w:spacing w:after="60"/>
-      </w:pPr>
+        <w:spacing w:after="20"/>
+      </w:pPr>
+      <w:r>
+        <w:rPr>
+          <w:b/>
+          <w:bCs/>
+          <w:color w:val="123A4F"/>
+          <w:sz w:val="20"/>
+          <w:szCs w:val="20"/>
+        </w:rPr>
+        <w:t xml:space="preserve">Est. U.S. retail — unheated (w/ report):  </w:t>
+      </w:r>
+      <w:r>
+        <w:rPr>
+          <w:b/>
+          <w:bCs/>
+          <w:color w:val="B8862F"/>
+          <w:sz w:val="22"/>
+          <w:szCs w:val="22"/>
+        </w:rPr>
+        <w:t xml:space="preserve">$1,350 – $3,200</w:t>
+      </w:r>
+    </w:p>
+    <w:p>
+      <w:pPr>
+        <w:spacing w:after="20"/>
+      </w:pPr>
+      <w:r>
+        <w:rPr>
+          <w:b/>
+          <w:bCs/>
+          <w:color w:val="5B6472"/>
+          <w:sz w:val="17"/>
+          <w:szCs w:val="17"/>
+        </w:rPr>
+        <w:t xml:space="preserve">Heated vs unheated:  </w:t>
+      </w:r>
       <w:r>
         <w:rPr>
           <w:i/>
@@ -1402,12 +1871,33 @@
           <w:sz w:val="17"/>
           <w:szCs w:val="17"/>
         </w:rPr>
-        <w:t xml:space="preserve">Note: Confirm sapphire + diamond carat; two-tone gold adds appeal.</w:t>
-      </w:r>
-    </w:p>
-    <w:p>
-      <w:r>
-        <w:br w:type="page"/>
+        <w:t xml:space="preserve">Fancy melee — heat status commercially minor; small premium only.</w:t>
+      </w:r>
+    </w:p>
+    <w:p>
+      <w:pPr>
+        <w:spacing w:after="60"/>
+      </w:pPr>
+      <w:r>
+        <w:rPr>
+          <w:i/>
+          <w:iCs/>
+          <w:color w:val="5B6472"/>
+          <w:sz w:val="17"/>
+          <w:szCs w:val="17"/>
+        </w:rPr>
+        <w:t xml:space="preserve">Also confirm: Confirm sapphire + diamond carat; two-tone gold adds appeal.</w:t>
+      </w:r>
+    </w:p>
+    <w:p>
+      <w:pPr>
+        <w:pBdr>
+          <w:bottom w:val="single" w:color="E3DDD0" w:sz="4"/>
+        </w:pBdr>
+        <w:spacing w:after="60"/>
+      </w:pPr>
+      <w:r>
+        <w:t xml:space="preserve"/>
       </w:r>
     </w:p>
     <w:p>
@@ -1531,7 +2021,7 @@
     </w:p>
     <w:p>
       <w:pPr>
-        <w:spacing w:after="30"/>
+        <w:spacing w:after="20"/>
       </w:pPr>
       <w:r>
         <w:rPr>
@@ -1541,7 +2031,7 @@
           <w:sz w:val="20"/>
           <w:szCs w:val="20"/>
         </w:rPr>
-        <w:t xml:space="preserve">Comfortable U.S. retail (est.):  </w:t>
+        <w:t xml:space="preserve">Est. U.S. retail — heated:  </w:t>
       </w:r>
       <w:r>
         <w:rPr>
@@ -1556,8 +2046,43 @@
     </w:p>
     <w:p>
       <w:pPr>
-        <w:spacing w:after="60"/>
-      </w:pPr>
+        <w:spacing w:after="20"/>
+      </w:pPr>
+      <w:r>
+        <w:rPr>
+          <w:b/>
+          <w:bCs/>
+          <w:color w:val="123A4F"/>
+          <w:sz w:val="20"/>
+          <w:szCs w:val="20"/>
+        </w:rPr>
+        <w:t xml:space="preserve">Est. U.S. retail — unheated (w/ report):  </w:t>
+      </w:r>
+      <w:r>
+        <w:rPr>
+          <w:b/>
+          <w:bCs/>
+          <w:color w:val="B8862F"/>
+          <w:sz w:val="22"/>
+          <w:szCs w:val="22"/>
+        </w:rPr>
+        <w:t xml:space="preserve">$2,400 – $5,500</w:t>
+      </w:r>
+    </w:p>
+    <w:p>
+      <w:pPr>
+        <w:spacing w:after="20"/>
+      </w:pPr>
+      <w:r>
+        <w:rPr>
+          <w:b/>
+          <w:bCs/>
+          <w:color w:val="5B6472"/>
+          <w:sz w:val="17"/>
+          <w:szCs w:val="17"/>
+        </w:rPr>
+        <w:t xml:space="preserve">Heated vs unheated:  </w:t>
+      </w:r>
       <w:r>
         <w:rPr>
           <w:i/>
@@ -1566,7 +2091,33 @@
           <w:sz w:val="17"/>
           <w:szCs w:val="17"/>
         </w:rPr>
-        <w:t xml:space="preserve">Note: Pink hue quality and carat drive value; confirm stone weight.</w:t>
+        <w:t xml:space="preserve">Pink-sapphire unheated premium is real but smaller than blue.</w:t>
+      </w:r>
+    </w:p>
+    <w:p>
+      <w:pPr>
+        <w:spacing w:after="60"/>
+      </w:pPr>
+      <w:r>
+        <w:rPr>
+          <w:i/>
+          <w:iCs/>
+          <w:color w:val="5B6472"/>
+          <w:sz w:val="17"/>
+          <w:szCs w:val="17"/>
+        </w:rPr>
+        <w:t xml:space="preserve">Also confirm: Pink hue quality and carat drive value; confirm stone weight.</w:t>
+      </w:r>
+    </w:p>
+    <w:p>
+      <w:pPr>
+        <w:pBdr>
+          <w:bottom w:val="single" w:color="E3DDD0" w:sz="4"/>
+        </w:pBdr>
+        <w:spacing w:after="60"/>
+      </w:pPr>
+      <w:r>
+        <w:t xml:space="preserve"/>
       </w:r>
     </w:p>
     <w:p>
@@ -1690,7 +2241,7 @@
     </w:p>
     <w:p>
       <w:pPr>
-        <w:spacing w:after="30"/>
+        <w:spacing w:after="20"/>
       </w:pPr>
       <w:r>
         <w:rPr>
@@ -1700,7 +2251,7 @@
           <w:sz w:val="20"/>
           <w:szCs w:val="20"/>
         </w:rPr>
-        <w:t xml:space="preserve">Comfortable U.S. retail (est.):  </w:t>
+        <w:t xml:space="preserve">Est. U.S. retail — heated:  </w:t>
       </w:r>
       <w:r>
         <w:rPr>
@@ -1715,22 +2266,78 @@
     </w:p>
     <w:p>
       <w:pPr>
-        <w:spacing w:after="60"/>
-      </w:pPr>
+        <w:spacing w:after="20"/>
+      </w:pPr>
+      <w:r>
+        <w:rPr>
+          <w:b/>
+          <w:bCs/>
+          <w:color w:val="123A4F"/>
+          <w:sz w:val="20"/>
+          <w:szCs w:val="20"/>
+        </w:rPr>
+        <w:t xml:space="preserve">Est. U.S. retail — unheated (w/ report):  </w:t>
+      </w:r>
       <w:r>
         <w:rPr>
           <w:i/>
           <w:iCs/>
           <w:color w:val="5B6472"/>
-          <w:sz w:val="17"/>
-          <w:szCs w:val="17"/>
-        </w:rPr>
-        <w:t xml:space="preserve">Note: Moonstone quality (blue sheen strength) + sapphire count drive value; confirm metal (silver vs gold).</w:t>
-      </w:r>
-    </w:p>
-    <w:p>
-      <w:r>
-        <w:br w:type="page"/>
+          <w:sz w:val="19"/>
+          <w:szCs w:val="19"/>
+        </w:rPr>
+        <w:t xml:space="preserve">not applicable (untreated stone — see note)</w:t>
+      </w:r>
+    </w:p>
+    <w:p>
+      <w:pPr>
+        <w:spacing w:after="20"/>
+      </w:pPr>
+      <w:r>
+        <w:rPr>
+          <w:b/>
+          <w:bCs/>
+          <w:color w:val="5B6472"/>
+          <w:sz w:val="17"/>
+          <w:szCs w:val="17"/>
+        </w:rPr>
+        <w:t xml:space="preserve">Heated vs unheated:  </w:t>
+      </w:r>
+      <w:r>
+        <w:rPr>
+          <w:i/>
+          <w:iCs/>
+          <w:color w:val="5B6472"/>
+          <w:sz w:val="17"/>
+          <w:szCs w:val="17"/>
+        </w:rPr>
+        <w:t xml:space="preserve">Not applicable — moonstone is never heat-treated; the sapphire accents are minor, so there is no unheated premium.</w:t>
+      </w:r>
+    </w:p>
+    <w:p>
+      <w:pPr>
+        <w:spacing w:after="60"/>
+      </w:pPr>
+      <w:r>
+        <w:rPr>
+          <w:i/>
+          <w:iCs/>
+          <w:color w:val="5B6472"/>
+          <w:sz w:val="17"/>
+          <w:szCs w:val="17"/>
+        </w:rPr>
+        <w:t xml:space="preserve">Also confirm: Moonstone quality (blue sheen strength) + sapphire count drive value; confirm metal (silver vs gold).</w:t>
+      </w:r>
+    </w:p>
+    <w:p>
+      <w:pPr>
+        <w:pBdr>
+          <w:bottom w:val="single" w:color="E3DDD0" w:sz="4"/>
+        </w:pBdr>
+        <w:spacing w:after="60"/>
+      </w:pPr>
+      <w:r>
+        <w:t xml:space="preserve"/>
       </w:r>
     </w:p>
     <w:p>
@@ -1854,7 +2461,7 @@
     </w:p>
     <w:p>
       <w:pPr>
-        <w:spacing w:after="30"/>
+        <w:spacing w:after="20"/>
       </w:pPr>
       <w:r>
         <w:rPr>
@@ -1864,7 +2471,7 @@
           <w:sz w:val="20"/>
           <w:szCs w:val="20"/>
         </w:rPr>
-        <w:t xml:space="preserve">Comfortable U.S. retail (est.):  </w:t>
+        <w:t xml:space="preserve">Est. U.S. retail — heated:  </w:t>
       </w:r>
       <w:r>
         <w:rPr>
@@ -1879,8 +2486,43 @@
     </w:p>
     <w:p>
       <w:pPr>
-        <w:spacing w:after="60"/>
-      </w:pPr>
+        <w:spacing w:after="20"/>
+      </w:pPr>
+      <w:r>
+        <w:rPr>
+          <w:b/>
+          <w:bCs/>
+          <w:color w:val="123A4F"/>
+          <w:sz w:val="20"/>
+          <w:szCs w:val="20"/>
+        </w:rPr>
+        <w:t xml:space="preserve">Est. U.S. retail — unheated (w/ report):  </w:t>
+      </w:r>
+      <w:r>
+        <w:rPr>
+          <w:b/>
+          <w:bCs/>
+          <w:color w:val="B8862F"/>
+          <w:sz w:val="22"/>
+          <w:szCs w:val="22"/>
+        </w:rPr>
+        <w:t xml:space="preserve">$2,000 – $5,500</w:t>
+      </w:r>
+    </w:p>
+    <w:p>
+      <w:pPr>
+        <w:spacing w:after="20"/>
+      </w:pPr>
+      <w:r>
+        <w:rPr>
+          <w:b/>
+          <w:bCs/>
+          <w:color w:val="5B6472"/>
+          <w:sz w:val="17"/>
+          <w:szCs w:val="17"/>
+        </w:rPr>
+        <w:t xml:space="preserve">Heated vs unheated:  </w:t>
+      </w:r>
       <w:r>
         <w:rPr>
           <w:i/>
@@ -1889,7 +2531,33 @@
           <w:sz w:val="17"/>
           <w:szCs w:val="17"/>
         </w:rPr>
-        <w:t xml:space="preserve">Note: Per ring. Star sharpness, body color and carat drive value; a clean centered star + lab note lifts it.</w:t>
+        <w:t xml:space="preserve">For STAR sapphire the value axis is 'no diffusion/lattice treatment' + a sharp natural star (AGL/GIA note) more than heat; that is what lifts it.</w:t>
+      </w:r>
+    </w:p>
+    <w:p>
+      <w:pPr>
+        <w:spacing w:after="60"/>
+      </w:pPr>
+      <w:r>
+        <w:rPr>
+          <w:i/>
+          <w:iCs/>
+          <w:color w:val="5B6472"/>
+          <w:sz w:val="17"/>
+          <w:szCs w:val="17"/>
+        </w:rPr>
+        <w:t xml:space="preserve">Also confirm: Per ring. Star sharpness, body color and carat drive value; a clean centered star + lab note lifts it.</w:t>
+      </w:r>
+    </w:p>
+    <w:p>
+      <w:pPr>
+        <w:pBdr>
+          <w:bottom w:val="single" w:color="E3DDD0" w:sz="4"/>
+        </w:pBdr>
+        <w:spacing w:after="60"/>
+      </w:pPr>
+      <w:r>
+        <w:t xml:space="preserve"/>
       </w:r>
     </w:p>
     <w:p>
@@ -2013,7 +2681,7 @@
     </w:p>
     <w:p>
       <w:pPr>
-        <w:spacing w:after="30"/>
+        <w:spacing w:after="20"/>
       </w:pPr>
       <w:r>
         <w:rPr>
@@ -2023,7 +2691,7 @@
           <w:sz w:val="20"/>
           <w:szCs w:val="20"/>
         </w:rPr>
-        <w:t xml:space="preserve">Comfortable U.S. retail (est.):  </w:t>
+        <w:t xml:space="preserve">Est. U.S. retail — heated:  </w:t>
       </w:r>
       <w:r>
         <w:rPr>
@@ -2038,22 +2706,78 @@
     </w:p>
     <w:p>
       <w:pPr>
-        <w:spacing w:after="60"/>
-      </w:pPr>
+        <w:spacing w:after="20"/>
+      </w:pPr>
+      <w:r>
+        <w:rPr>
+          <w:b/>
+          <w:bCs/>
+          <w:color w:val="123A4F"/>
+          <w:sz w:val="20"/>
+          <w:szCs w:val="20"/>
+        </w:rPr>
+        <w:t xml:space="preserve">Est. U.S. retail — unheated (w/ report):  </w:t>
+      </w:r>
       <w:r>
         <w:rPr>
           <w:i/>
           <w:iCs/>
           <w:color w:val="5B6472"/>
-          <w:sz w:val="17"/>
-          <w:szCs w:val="17"/>
-        </w:rPr>
-        <w:t xml:space="preserve">Note: Confirm moonstone size/quality and sapphire count/metal.</w:t>
-      </w:r>
-    </w:p>
-    <w:p>
-      <w:r>
-        <w:br w:type="page"/>
+          <w:sz w:val="19"/>
+          <w:szCs w:val="19"/>
+        </w:rPr>
+        <w:t xml:space="preserve">not applicable (untreated stone — see note)</w:t>
+      </w:r>
+    </w:p>
+    <w:p>
+      <w:pPr>
+        <w:spacing w:after="20"/>
+      </w:pPr>
+      <w:r>
+        <w:rPr>
+          <w:b/>
+          <w:bCs/>
+          <w:color w:val="5B6472"/>
+          <w:sz w:val="17"/>
+          <w:szCs w:val="17"/>
+        </w:rPr>
+        <w:t xml:space="preserve">Heated vs unheated:  </w:t>
+      </w:r>
+      <w:r>
+        <w:rPr>
+          <w:i/>
+          <w:iCs/>
+          <w:color w:val="5B6472"/>
+          <w:sz w:val="17"/>
+          <w:szCs w:val="17"/>
+        </w:rPr>
+        <w:t xml:space="preserve">Not applicable — moonstone is untreated; the sapphire pavé is minor.</w:t>
+      </w:r>
+    </w:p>
+    <w:p>
+      <w:pPr>
+        <w:spacing w:after="60"/>
+      </w:pPr>
+      <w:r>
+        <w:rPr>
+          <w:i/>
+          <w:iCs/>
+          <w:color w:val="5B6472"/>
+          <w:sz w:val="17"/>
+          <w:szCs w:val="17"/>
+        </w:rPr>
+        <w:t xml:space="preserve">Also confirm: Confirm moonstone size/quality and sapphire count/metal.</w:t>
+      </w:r>
+    </w:p>
+    <w:p>
+      <w:pPr>
+        <w:pBdr>
+          <w:bottom w:val="single" w:color="E3DDD0" w:sz="4"/>
+        </w:pBdr>
+        <w:spacing w:after="60"/>
+      </w:pPr>
+      <w:r>
+        <w:t xml:space="preserve"/>
       </w:r>
     </w:p>
     <w:p>
@@ -2177,7 +2901,7 @@
     </w:p>
     <w:p>
       <w:pPr>
-        <w:spacing w:after="30"/>
+        <w:spacing w:after="20"/>
       </w:pPr>
       <w:r>
         <w:rPr>
@@ -2187,7 +2911,7 @@
           <w:sz w:val="20"/>
           <w:szCs w:val="20"/>
         </w:rPr>
-        <w:t xml:space="preserve">Comfortable U.S. retail (est.):  </w:t>
+        <w:t xml:space="preserve">Est. U.S. retail — heated:  </w:t>
       </w:r>
       <w:r>
         <w:rPr>
@@ -2202,8 +2926,43 @@
     </w:p>
     <w:p>
       <w:pPr>
-        <w:spacing w:after="60"/>
-      </w:pPr>
+        <w:spacing w:after="20"/>
+      </w:pPr>
+      <w:r>
+        <w:rPr>
+          <w:b/>
+          <w:bCs/>
+          <w:color w:val="123A4F"/>
+          <w:sz w:val="20"/>
+          <w:szCs w:val="20"/>
+        </w:rPr>
+        <w:t xml:space="preserve">Est. U.S. retail — unheated (w/ report):  </w:t>
+      </w:r>
+      <w:r>
+        <w:rPr>
+          <w:b/>
+          <w:bCs/>
+          <w:color w:val="B8862F"/>
+          <w:sz w:val="22"/>
+          <w:szCs w:val="22"/>
+        </w:rPr>
+        <w:t xml:space="preserve">$2,400 – $5,500</w:t>
+      </w:r>
+    </w:p>
+    <w:p>
+      <w:pPr>
+        <w:spacing w:after="20"/>
+      </w:pPr>
+      <w:r>
+        <w:rPr>
+          <w:b/>
+          <w:bCs/>
+          <w:color w:val="5B6472"/>
+          <w:sz w:val="17"/>
+          <w:szCs w:val="17"/>
+        </w:rPr>
+        <w:t xml:space="preserve">Heated vs unheated:  </w:t>
+      </w:r>
       <w:r>
         <w:rPr>
           <w:i/>
@@ -2212,7 +2971,33 @@
           <w:sz w:val="17"/>
           <w:szCs w:val="17"/>
         </w:rPr>
-        <w:t xml:space="preserve">Note: Confirm total sapphire + diamond carat and gold weight (fringe styles use more gold).</w:t>
+        <w:t xml:space="preserve">Yellow-sapphire unheated premium is modest; watch for beryllium/diffusion treatment (must be disclosed) — that is a bigger negative than heat.</w:t>
+      </w:r>
+    </w:p>
+    <w:p>
+      <w:pPr>
+        <w:spacing w:after="60"/>
+      </w:pPr>
+      <w:r>
+        <w:rPr>
+          <w:i/>
+          <w:iCs/>
+          <w:color w:val="5B6472"/>
+          <w:sz w:val="17"/>
+          <w:szCs w:val="17"/>
+        </w:rPr>
+        <w:t xml:space="preserve">Also confirm: Confirm total sapphire + diamond carat and gold weight (fringe styles use more gold).</w:t>
+      </w:r>
+    </w:p>
+    <w:p>
+      <w:pPr>
+        <w:pBdr>
+          <w:bottom w:val="single" w:color="E3DDD0" w:sz="4"/>
+        </w:pBdr>
+        <w:spacing w:after="60"/>
+      </w:pPr>
+      <w:r>
+        <w:t xml:space="preserve"/>
       </w:r>
     </w:p>
     <w:p>
@@ -2336,7 +3121,7 @@
     </w:p>
     <w:p>
       <w:pPr>
-        <w:spacing w:after="30"/>
+        <w:spacing w:after="20"/>
       </w:pPr>
       <w:r>
         <w:rPr>
@@ -2346,7 +3131,7 @@
           <w:sz w:val="20"/>
           <w:szCs w:val="20"/>
         </w:rPr>
-        <w:t xml:space="preserve">Comfortable U.S. retail (est.):  </w:t>
+        <w:t xml:space="preserve">Est. U.S. retail — heated:  </w:t>
       </w:r>
       <w:r>
         <w:rPr>
@@ -2361,8 +3146,43 @@
     </w:p>
     <w:p>
       <w:pPr>
-        <w:spacing w:after="60"/>
-      </w:pPr>
+        <w:spacing w:after="20"/>
+      </w:pPr>
+      <w:r>
+        <w:rPr>
+          <w:b/>
+          <w:bCs/>
+          <w:color w:val="123A4F"/>
+          <w:sz w:val="20"/>
+          <w:szCs w:val="20"/>
+        </w:rPr>
+        <w:t xml:space="preserve">Est. U.S. retail — unheated (w/ report):  </w:t>
+      </w:r>
+      <w:r>
+        <w:rPr>
+          <w:b/>
+          <w:bCs/>
+          <w:color w:val="B8862F"/>
+          <w:sz w:val="22"/>
+          <w:szCs w:val="22"/>
+        </w:rPr>
+        <w:t xml:space="preserve">$2,300 – $5,500</w:t>
+      </w:r>
+    </w:p>
+    <w:p>
+      <w:pPr>
+        <w:spacing w:after="20"/>
+      </w:pPr>
+      <w:r>
+        <w:rPr>
+          <w:b/>
+          <w:bCs/>
+          <w:color w:val="5B6472"/>
+          <w:sz w:val="17"/>
+          <w:szCs w:val="17"/>
+        </w:rPr>
+        <w:t xml:space="preserve">Heated vs unheated:  </w:t>
+      </w:r>
       <w:r>
         <w:rPr>
           <w:i/>
@@ -2371,12 +3191,33 @@
           <w:sz w:val="17"/>
           <w:szCs w:val="17"/>
         </w:rPr>
-        <w:t xml:space="preserve">Note: Diamond content is significant; confirm total diamond carat + sapphire size.</w:t>
-      </w:r>
-    </w:p>
-    <w:p>
-      <w:r>
-        <w:br w:type="page"/>
+        <w:t xml:space="preserve">Premium applies to the pear-sapphire center; heavy diamond content dilutes the overall % impact.</w:t>
+      </w:r>
+    </w:p>
+    <w:p>
+      <w:pPr>
+        <w:spacing w:after="60"/>
+      </w:pPr>
+      <w:r>
+        <w:rPr>
+          <w:i/>
+          <w:iCs/>
+          <w:color w:val="5B6472"/>
+          <w:sz w:val="17"/>
+          <w:szCs w:val="17"/>
+        </w:rPr>
+        <w:t xml:space="preserve">Also confirm: Diamond content is significant; confirm total diamond carat + sapphire size.</w:t>
+      </w:r>
+    </w:p>
+    <w:p>
+      <w:pPr>
+        <w:pBdr>
+          <w:bottom w:val="single" w:color="E3DDD0" w:sz="4"/>
+        </w:pBdr>
+        <w:spacing w:after="60"/>
+      </w:pPr>
+      <w:r>
+        <w:t xml:space="preserve"/>
       </w:r>
     </w:p>
     <w:p>
@@ -2500,7 +3341,7 @@
     </w:p>
     <w:p>
       <w:pPr>
-        <w:spacing w:after="30"/>
+        <w:spacing w:after="20"/>
       </w:pPr>
       <w:r>
         <w:rPr>
@@ -2510,7 +3351,7 @@
           <w:sz w:val="20"/>
           <w:szCs w:val="20"/>
         </w:rPr>
-        <w:t xml:space="preserve">Comfortable U.S. retail (est.):  </w:t>
+        <w:t xml:space="preserve">Est. U.S. retail — heated:  </w:t>
       </w:r>
       <w:r>
         <w:rPr>
@@ -2525,8 +3366,43 @@
     </w:p>
     <w:p>
       <w:pPr>
-        <w:spacing w:after="60"/>
-      </w:pPr>
+        <w:spacing w:after="20"/>
+      </w:pPr>
+      <w:r>
+        <w:rPr>
+          <w:b/>
+          <w:bCs/>
+          <w:color w:val="123A4F"/>
+          <w:sz w:val="20"/>
+          <w:szCs w:val="20"/>
+        </w:rPr>
+        <w:t xml:space="preserve">Est. U.S. retail — unheated (w/ report):  </w:t>
+      </w:r>
+      <w:r>
+        <w:rPr>
+          <w:b/>
+          <w:bCs/>
+          <w:color w:val="B8862F"/>
+          <w:sz w:val="22"/>
+          <w:szCs w:val="22"/>
+        </w:rPr>
+        <w:t xml:space="preserve">$1,800 – $3,800</w:t>
+      </w:r>
+    </w:p>
+    <w:p>
+      <w:pPr>
+        <w:spacing w:after="20"/>
+      </w:pPr>
+      <w:r>
+        <w:rPr>
+          <w:b/>
+          <w:bCs/>
+          <w:color w:val="5B6472"/>
+          <w:sz w:val="17"/>
+          <w:szCs w:val="17"/>
+        </w:rPr>
+        <w:t xml:space="preserve">Heated vs unheated:  </w:t>
+      </w:r>
       <w:r>
         <w:rPr>
           <w:i/>
@@ -2535,7 +3411,33 @@
           <w:sz w:val="17"/>
           <w:szCs w:val="17"/>
         </w:rPr>
-        <w:t xml:space="preserve">Note: Priced as a set; confirm whether sold together and the sapphire carats.</w:t>
+        <w:t xml:space="preserve">Pink-sapphire unheated premium is real but smaller than blue.</w:t>
+      </w:r>
+    </w:p>
+    <w:p>
+      <w:pPr>
+        <w:spacing w:after="60"/>
+      </w:pPr>
+      <w:r>
+        <w:rPr>
+          <w:i/>
+          <w:iCs/>
+          <w:color w:val="5B6472"/>
+          <w:sz w:val="17"/>
+          <w:szCs w:val="17"/>
+        </w:rPr>
+        <w:t xml:space="preserve">Also confirm: Priced as a set; confirm whether sold together and the sapphire carats.</w:t>
+      </w:r>
+    </w:p>
+    <w:p>
+      <w:pPr>
+        <w:pBdr>
+          <w:bottom w:val="single" w:color="E3DDD0" w:sz="4"/>
+        </w:pBdr>
+        <w:spacing w:after="60"/>
+      </w:pPr>
+      <w:r>
+        <w:t xml:space="preserve"/>
       </w:r>
     </w:p>
     <w:p>

</xml_diff>